<commit_message>
sync: resolve inventory.xlsx and stage recent updates
</commit_message>
<xml_diff>
--- a/Invoices/Zayo_Tech_Hub_Modern_Invoice.docx
+++ b/Invoices/Zayo_Tech_Hub_Modern_Invoice.docx
@@ -276,7 +276,34 @@
                       <w:color w:val="102A52"/>
                       <w:sz w:val="17"/>
                     </w:rPr>
-                    <w:t>018-001</w:t>
+                    <w:t>0</w:t>
+                  </w:r>
+                  <w:r>
+                    <w:rPr>
+                      <w:rFonts w:ascii="Aptos" w:hAnsi="Aptos"/>
+                      <w:b/>
+                      <w:color w:val="102A52"/>
+                      <w:sz w:val="17"/>
+                    </w:rPr>
+                    <w:t>20</w:t>
+                  </w:r>
+                  <w:r>
+                    <w:rPr>
+                      <w:rFonts w:ascii="Aptos" w:hAnsi="Aptos"/>
+                      <w:b/>
+                      <w:color w:val="102A52"/>
+                      <w:sz w:val="17"/>
+                    </w:rPr>
+                    <w:t>-00</w:t>
+                  </w:r>
+                  <w:r>
+                    <w:rPr>
+                      <w:rFonts w:ascii="Aptos" w:hAnsi="Aptos"/>
+                      <w:b/>
+                      <w:color w:val="102A52"/>
+                      <w:sz w:val="17"/>
+                    </w:rPr>
+                    <w:t>3</w:t>
                   </w:r>
                 </w:p>
               </w:tc>
@@ -344,7 +371,7 @@
                       <w:color w:val="102A52"/>
                       <w:sz w:val="17"/>
                     </w:rPr>
-                    <w:t>18</w:t>
+                    <w:t>20</w:t>
                   </w:r>
                   <w:r>
                     <w:rPr>
@@ -430,7 +457,7 @@
                       <w:color w:val="102A52"/>
                       <w:sz w:val="17"/>
                     </w:rPr>
-                    <w:t>18</w:t>
+                    <w:t>20</w:t>
                   </w:r>
                   <w:r>
                     <w:rPr>
@@ -439,7 +466,16 @@
                       <w:color w:val="102A52"/>
                       <w:sz w:val="17"/>
                     </w:rPr>
-                    <w:t>-001</w:t>
+                    <w:t>-00</w:t>
+                  </w:r>
+                  <w:r>
+                    <w:rPr>
+                      <w:rFonts w:ascii="Aptos" w:hAnsi="Aptos"/>
+                      <w:b/>
+                      <w:color w:val="102A52"/>
+                      <w:sz w:val="17"/>
+                    </w:rPr>
+                    <w:t>3</w:t>
                   </w:r>
                 </w:p>
               </w:tc>
@@ -587,15 +623,7 @@
                 <w:color w:val="102A52"/>
                 <w:sz w:val="19"/>
               </w:rPr>
-              <w:t>Mirpur-14,</w:t>
-            </w:r>
-            <w:r>
-              <w:rPr>
-                <w:rFonts w:ascii="Aptos" w:hAnsi="Aptos"/>
-                <w:color w:val="102A52"/>
-                <w:sz w:val="19"/>
-              </w:rPr>
-              <w:t>Dhaka, Bangladesh</w:t>
+              <w:t>Mirpur-14,Dhaka, Bangladesh</w:t>
             </w:r>
           </w:p>
         </w:tc>
@@ -638,7 +666,7 @@
                 <w:color w:val="102A52"/>
                 <w:sz w:val="19"/>
               </w:rPr>
-              <w:t>Ahmed Faysal</w:t>
+              <w:t>Abir Hasan</w:t>
             </w:r>
           </w:p>
           <w:p>
@@ -659,7 +687,7 @@
                 <w:color w:val="102A52"/>
                 <w:sz w:val="19"/>
               </w:rPr>
-              <w:t>870639096</w:t>
+              <w:t>911585072</w:t>
             </w:r>
           </w:p>
           <w:p>
@@ -672,43 +700,7 @@
                 <w:color w:val="102A52"/>
                 <w:sz w:val="19"/>
               </w:rPr>
-              <w:t xml:space="preserve">219/B&amp;C </w:t>
-            </w:r>
-            <w:proofErr w:type="spellStart"/>
-            <w:r>
-              <w:rPr>
-                <w:rFonts w:ascii="Aptos" w:hAnsi="Aptos"/>
-                <w:color w:val="102A52"/>
-                <w:sz w:val="19"/>
-              </w:rPr>
-              <w:t>tejkuni</w:t>
-            </w:r>
-            <w:proofErr w:type="spellEnd"/>
-            <w:r>
-              <w:rPr>
-                <w:rFonts w:ascii="Aptos" w:hAnsi="Aptos"/>
-                <w:color w:val="102A52"/>
-                <w:sz w:val="19"/>
-              </w:rPr>
-              <w:t xml:space="preserve"> para, 12/4 west </w:t>
-            </w:r>
-            <w:proofErr w:type="spellStart"/>
-            <w:r>
-              <w:rPr>
-                <w:rFonts w:ascii="Aptos" w:hAnsi="Aptos"/>
-                <w:color w:val="102A52"/>
-                <w:sz w:val="19"/>
-              </w:rPr>
-              <w:t>nakhalpara</w:t>
-            </w:r>
-            <w:proofErr w:type="spellEnd"/>
-            <w:r>
-              <w:rPr>
-                <w:rFonts w:ascii="Aptos" w:hAnsi="Aptos"/>
-                <w:color w:val="102A52"/>
-                <w:sz w:val="19"/>
-              </w:rPr>
-              <w:t>, flat8/D</w:t>
+              <w:t xml:space="preserve">Doptor Khana, Barisal sadar, Barisal, </w:t>
             </w:r>
             <w:r>
               <w:rPr>
@@ -716,23 +708,7 @@
                 <w:color w:val="102A52"/>
                 <w:sz w:val="19"/>
               </w:rPr>
-              <w:t>, Dhaka</w:t>
-            </w:r>
-            <w:r>
-              <w:rPr>
-                <w:rFonts w:ascii="Aptos" w:hAnsi="Aptos"/>
-                <w:color w:val="102A52"/>
-                <w:sz w:val="19"/>
-              </w:rPr>
-              <w:t>-1215</w:t>
-            </w:r>
-            <w:r>
-              <w:rPr>
-                <w:rFonts w:ascii="Aptos" w:hAnsi="Aptos"/>
-                <w:color w:val="102A52"/>
-                <w:sz w:val="19"/>
-              </w:rPr>
-              <w:t>, Bangladesh</w:t>
+              <w:t>Bangladesh</w:t>
             </w:r>
           </w:p>
         </w:tc>
@@ -742,7 +718,6 @@
       <w:pPr>
         <w:spacing w:before="160" w:after="100"/>
       </w:pPr>
-      <w:proofErr w:type="gramStart"/>
       <w:r>
         <w:rPr>
           <w:rFonts w:ascii="Aptos Display" w:hAnsi="Aptos Display"/>
@@ -750,22 +725,12 @@
           <w:color w:val="102A52"/>
           <w:sz w:val="23"/>
         </w:rPr>
-        <w:t>▣  PRODUCT</w:t>
-      </w:r>
-      <w:proofErr w:type="gramEnd"/>
-      <w:r>
-        <w:rPr>
-          <w:rFonts w:ascii="Aptos Display" w:hAnsi="Aptos Display"/>
-          <w:b/>
-          <w:color w:val="102A52"/>
-          <w:sz w:val="23"/>
-        </w:rPr>
-        <w:t xml:space="preserve"> DETAILS</w:t>
+        <w:t>▣  PRODUCT DETAILS</w:t>
       </w:r>
     </w:p>
     <w:tbl>
       <w:tblPr>
-        <w:tblW w:w="0" w:type="auto"/>
+        <w:tblW w:w="11304" w:type="dxa"/>
         <w:jc w:val="center"/>
         <w:tblLayout w:type="fixed"/>
         <w:tblLook w:val="04A0" w:firstRow="1" w:lastRow="0" w:firstColumn="1" w:lastColumn="0" w:noHBand="0" w:noVBand="1"/>
@@ -778,6 +743,7 @@
       </w:tblGrid>
       <w:tr>
         <w:trPr>
+          <w:trHeight w:val="490"/>
           <w:jc w:val="center"/>
         </w:trPr>
         <w:tc>
@@ -830,22 +796,27 @@
           </w:tcPr>
           <w:p>
             <w:pPr>
-              <w:spacing w:after="0" w:line="216" w:lineRule="auto"/>
               <w:rPr>
-                <w:rFonts w:ascii="Aptos" w:hAnsi="Aptos"/>
-                <w:b/>
-                <w:color w:val="102A52"/>
-                <w:sz w:val="17"/>
+                <w:rFonts w:ascii="Calibri" w:hAnsi="Calibri" w:cs="Calibri"/>
+                <w:sz w:val="20"/>
+                <w:szCs w:val="20"/>
               </w:rPr>
             </w:pPr>
             <w:r>
               <w:rPr>
-                <w:rFonts w:ascii="Aptos" w:hAnsi="Aptos"/>
-                <w:b/>
-                <w:color w:val="102A52"/>
-                <w:sz w:val="17"/>
+                <w:rFonts w:ascii="Calibri" w:hAnsi="Calibri" w:cs="Calibri"/>
+                <w:sz w:val="20"/>
+                <w:szCs w:val="20"/>
               </w:rPr>
-              <w:t>Luxury Matte Ultra-Slim Magnetic Case for Realme Neo 8 – Anti-Fingerprint Heat Cooling Shockproof Back Cover</w:t>
+              <w:t xml:space="preserve">Realme Neo 8 </w:t>
+            </w:r>
+            <w:r>
+              <w:rPr>
+                <w:rFonts w:ascii="Calibri" w:hAnsi="Calibri" w:cs="Calibri"/>
+                <w:sz w:val="20"/>
+                <w:szCs w:val="20"/>
+              </w:rPr>
+              <w:t>Back Cover</w:t>
             </w:r>
           </w:p>
         </w:tc>
@@ -899,153 +870,22 @@
           </w:tcPr>
           <w:p>
             <w:pPr>
-              <w:spacing w:after="0" w:line="216" w:lineRule="auto"/>
+              <w:pStyle w:val="Heading2"/>
               <w:rPr>
-                <w:rFonts w:ascii="Aptos" w:hAnsi="Aptos"/>
-                <w:b/>
-                <w:color w:val="102A52"/>
-                <w:sz w:val="17"/>
+                <w:rFonts w:ascii="Aptos" w:hAnsi="Aptos" w:cstheme="majorHAnsi"/>
+                <w:color w:val="1F497D" w:themeColor="text2"/>
+                <w:sz w:val="18"/>
+                <w:szCs w:val="18"/>
               </w:rPr>
             </w:pPr>
             <w:r>
               <w:rPr>
-                <w:rFonts w:ascii="Aptos" w:hAnsi="Aptos"/>
-                <w:b/>
-                <w:color w:val="102A52"/>
-                <w:sz w:val="17"/>
+                <w:rFonts w:ascii="Aptos" w:hAnsi="Aptos" w:cstheme="majorHAnsi"/>
+                <w:color w:val="1F497D" w:themeColor="text2"/>
+                <w:sz w:val="18"/>
+                <w:szCs w:val="18"/>
               </w:rPr>
-              <w:t>RN8-PC-CG-M</w:t>
-            </w:r>
-          </w:p>
-        </w:tc>
-      </w:tr>
-      <w:tr>
-        <w:trPr>
-          <w:jc w:val="center"/>
-        </w:trPr>
-        <w:tc>
-          <w:tcPr>
-            <w:tcW w:w="2275" w:type="dxa"/>
-            <w:tcBorders>
-              <w:top w:val="single" w:sz="5" w:space="0" w:color="C8D5E5"/>
-              <w:left w:val="single" w:sz="5" w:space="0" w:color="C8D5E5"/>
-              <w:bottom w:val="single" w:sz="5" w:space="0" w:color="C8D5E5"/>
-              <w:right w:val="single" w:sz="5" w:space="0" w:color="C8D5E5"/>
-            </w:tcBorders>
-            <w:shd w:val="clear" w:color="auto" w:fill="F5F8FC"/>
-            <w:tcMar>
-              <w:top w:w="85" w:type="dxa"/>
-              <w:left w:w="100" w:type="dxa"/>
-              <w:bottom w:w="85" w:type="dxa"/>
-              <w:right w:w="100" w:type="dxa"/>
-            </w:tcMar>
-          </w:tcPr>
-          <w:p>
-            <w:pPr>
-              <w:spacing w:after="0" w:line="216" w:lineRule="auto"/>
-            </w:pPr>
-            <w:r>
-              <w:rPr>
-                <w:rFonts w:ascii="Aptos" w:hAnsi="Aptos"/>
-                <w:color w:val="102A52"/>
-                <w:sz w:val="17"/>
-              </w:rPr>
-              <w:t>Material</w:t>
-            </w:r>
-          </w:p>
-        </w:tc>
-        <w:tc>
-          <w:tcPr>
-            <w:tcW w:w="3485" w:type="dxa"/>
-            <w:tcBorders>
-              <w:top w:val="single" w:sz="5" w:space="0" w:color="C8D5E5"/>
-              <w:left w:val="single" w:sz="5" w:space="0" w:color="C8D5E5"/>
-              <w:bottom w:val="single" w:sz="5" w:space="0" w:color="C8D5E5"/>
-              <w:right w:val="single" w:sz="5" w:space="0" w:color="C8D5E5"/>
-            </w:tcBorders>
-            <w:shd w:val="clear" w:color="auto" w:fill="FFFFFF"/>
-            <w:tcMar>
-              <w:top w:w="85" w:type="dxa"/>
-              <w:left w:w="100" w:type="dxa"/>
-              <w:bottom w:w="85" w:type="dxa"/>
-              <w:right w:w="100" w:type="dxa"/>
-            </w:tcMar>
-          </w:tcPr>
-          <w:p>
-            <w:pPr>
-              <w:spacing w:after="0" w:line="216" w:lineRule="auto"/>
-            </w:pPr>
-            <w:r>
-              <w:rPr>
-                <w:rFonts w:ascii="Aptos" w:hAnsi="Aptos"/>
-                <w:b/>
-                <w:color w:val="102A52"/>
-                <w:sz w:val="17"/>
-              </w:rPr>
-              <w:t>Protective magnetic</w:t>
-            </w:r>
-          </w:p>
-        </w:tc>
-        <w:tc>
-          <w:tcPr>
-            <w:tcW w:w="2275" w:type="dxa"/>
-            <w:tcBorders>
-              <w:top w:val="single" w:sz="5" w:space="0" w:color="C8D5E5"/>
-              <w:left w:val="single" w:sz="5" w:space="0" w:color="C8D5E5"/>
-              <w:bottom w:val="single" w:sz="5" w:space="0" w:color="C8D5E5"/>
-              <w:right w:val="single" w:sz="5" w:space="0" w:color="C8D5E5"/>
-            </w:tcBorders>
-            <w:shd w:val="clear" w:color="auto" w:fill="F5F8FC"/>
-            <w:tcMar>
-              <w:top w:w="85" w:type="dxa"/>
-              <w:left w:w="100" w:type="dxa"/>
-              <w:bottom w:w="85" w:type="dxa"/>
-              <w:right w:w="100" w:type="dxa"/>
-            </w:tcMar>
-          </w:tcPr>
-          <w:p>
-            <w:pPr>
-              <w:spacing w:after="0" w:line="216" w:lineRule="auto"/>
-            </w:pPr>
-            <w:r>
-              <w:rPr>
-                <w:rFonts w:ascii="Aptos" w:hAnsi="Aptos"/>
-                <w:color w:val="102A52"/>
-                <w:sz w:val="17"/>
-              </w:rPr>
-              <w:t>Color</w:t>
-            </w:r>
-          </w:p>
-        </w:tc>
-        <w:tc>
-          <w:tcPr>
-            <w:tcW w:w="3269" w:type="dxa"/>
-            <w:tcBorders>
-              <w:top w:val="single" w:sz="5" w:space="0" w:color="C8D5E5"/>
-              <w:left w:val="single" w:sz="5" w:space="0" w:color="C8D5E5"/>
-              <w:bottom w:val="single" w:sz="5" w:space="0" w:color="C8D5E5"/>
-              <w:right w:val="single" w:sz="5" w:space="0" w:color="C8D5E5"/>
-            </w:tcBorders>
-            <w:shd w:val="clear" w:color="auto" w:fill="FFFFFF"/>
-            <w:tcMar>
-              <w:top w:w="85" w:type="dxa"/>
-              <w:left w:w="100" w:type="dxa"/>
-              <w:bottom w:w="85" w:type="dxa"/>
-              <w:right w:w="100" w:type="dxa"/>
-            </w:tcMar>
-          </w:tcPr>
-          <w:p>
-            <w:pPr>
-              <w:spacing w:after="0" w:line="216" w:lineRule="auto"/>
-            </w:pPr>
-            <w:r>
-              <w:rPr>
-                <w:rFonts w:ascii="Aptos" w:hAnsi="Aptos"/>
-                <w:b/>
-                <w:color w:val="102A52"/>
-                <w:sz w:val="17"/>
-              </w:rPr>
-              <w:t>Charcoal Gray</w:t>
+              <w:t>RN8-SIL-GY-M</w:t>
             </w:r>
           </w:p>
         </w:tc>
@@ -1198,28 +1038,30 @@
     </w:p>
     <w:tbl>
       <w:tblPr>
-        <w:tblW w:w="0" w:type="auto"/>
+        <w:tblW w:w="12136" w:type="dxa"/>
         <w:jc w:val="center"/>
         <w:tblLayout w:type="fixed"/>
         <w:tblLook w:val="04A0" w:firstRow="1" w:lastRow="0" w:firstColumn="1" w:lastColumn="0" w:noHBand="0" w:noVBand="1"/>
       </w:tblPr>
       <w:tblGrid>
-        <w:gridCol w:w="576"/>
-        <w:gridCol w:w="2333"/>
-        <w:gridCol w:w="1469"/>
-        <w:gridCol w:w="1656"/>
-        <w:gridCol w:w="1512"/>
-        <w:gridCol w:w="1123"/>
-        <w:gridCol w:w="1181"/>
-        <w:gridCol w:w="979"/>
+        <w:gridCol w:w="560"/>
+        <w:gridCol w:w="2674"/>
+        <w:gridCol w:w="1350"/>
+        <w:gridCol w:w="1350"/>
+        <w:gridCol w:w="1542"/>
+        <w:gridCol w:w="1470"/>
+        <w:gridCol w:w="1091"/>
+        <w:gridCol w:w="1148"/>
+        <w:gridCol w:w="951"/>
       </w:tblGrid>
       <w:tr>
         <w:trPr>
+          <w:trHeight w:val="330"/>
           <w:jc w:val="center"/>
         </w:trPr>
         <w:tc>
           <w:tcPr>
-            <w:tcW w:w="576" w:type="dxa"/>
+            <w:tcW w:w="560" w:type="dxa"/>
             <w:tcBorders>
               <w:top w:val="single" w:sz="5" w:space="0" w:color="C8D5E5"/>
               <w:left w:val="single" w:sz="5" w:space="0" w:color="C8D5E5"/>
@@ -1252,7 +1094,7 @@
         </w:tc>
         <w:tc>
           <w:tcPr>
-            <w:tcW w:w="2333" w:type="dxa"/>
+            <w:tcW w:w="2674" w:type="dxa"/>
             <w:tcBorders>
               <w:top w:val="single" w:sz="5" w:space="0" w:color="C8D5E5"/>
               <w:left w:val="single" w:sz="5" w:space="0" w:color="C8D5E5"/>
@@ -1285,7 +1127,7 @@
         </w:tc>
         <w:tc>
           <w:tcPr>
-            <w:tcW w:w="1469" w:type="dxa"/>
+            <w:tcW w:w="1350" w:type="dxa"/>
             <w:tcBorders>
               <w:top w:val="single" w:sz="5" w:space="0" w:color="C8D5E5"/>
               <w:left w:val="single" w:sz="5" w:space="0" w:color="C8D5E5"/>
@@ -1318,7 +1160,40 @@
         </w:tc>
         <w:tc>
           <w:tcPr>
-            <w:tcW w:w="1656" w:type="dxa"/>
+            <w:tcW w:w="1350" w:type="dxa"/>
+            <w:tcBorders>
+              <w:top w:val="single" w:sz="5" w:space="0" w:color="C8D5E5"/>
+              <w:left w:val="single" w:sz="5" w:space="0" w:color="C8D5E5"/>
+              <w:bottom w:val="single" w:sz="5" w:space="0" w:color="C8D5E5"/>
+              <w:right w:val="single" w:sz="5" w:space="0" w:color="C8D5E5"/>
+            </w:tcBorders>
+            <w:shd w:val="clear" w:color="auto" w:fill="EAF2FB"/>
+          </w:tcPr>
+          <w:p>
+            <w:pPr>
+              <w:spacing w:after="0" w:line="216" w:lineRule="auto"/>
+              <w:jc w:val="center"/>
+              <w:rPr>
+                <w:rFonts w:ascii="Aptos" w:hAnsi="Aptos"/>
+                <w:b/>
+                <w:color w:val="102A52"/>
+                <w:sz w:val="15"/>
+              </w:rPr>
+            </w:pPr>
+            <w:r>
+              <w:rPr>
+                <w:rFonts w:ascii="Aptos" w:hAnsi="Aptos"/>
+                <w:b/>
+                <w:color w:val="102A52"/>
+                <w:sz w:val="15"/>
+              </w:rPr>
+              <w:t>material</w:t>
+            </w:r>
+          </w:p>
+        </w:tc>
+        <w:tc>
+          <w:tcPr>
+            <w:tcW w:w="1542" w:type="dxa"/>
             <w:tcBorders>
               <w:top w:val="single" w:sz="5" w:space="0" w:color="C8D5E5"/>
               <w:left w:val="single" w:sz="5" w:space="0" w:color="C8D5E5"/>
@@ -1351,7 +1226,7 @@
         </w:tc>
         <w:tc>
           <w:tcPr>
-            <w:tcW w:w="1512" w:type="dxa"/>
+            <w:tcW w:w="1470" w:type="dxa"/>
             <w:tcBorders>
               <w:top w:val="single" w:sz="5" w:space="0" w:color="C8D5E5"/>
               <w:left w:val="single" w:sz="5" w:space="0" w:color="C8D5E5"/>
@@ -1384,7 +1259,7 @@
         </w:tc>
         <w:tc>
           <w:tcPr>
-            <w:tcW w:w="1123" w:type="dxa"/>
+            <w:tcW w:w="1091" w:type="dxa"/>
             <w:tcBorders>
               <w:top w:val="single" w:sz="5" w:space="0" w:color="C8D5E5"/>
               <w:left w:val="single" w:sz="5" w:space="0" w:color="C8D5E5"/>
@@ -1417,7 +1292,7 @@
         </w:tc>
         <w:tc>
           <w:tcPr>
-            <w:tcW w:w="1181" w:type="dxa"/>
+            <w:tcW w:w="1148" w:type="dxa"/>
             <w:tcBorders>
               <w:top w:val="single" w:sz="5" w:space="0" w:color="C8D5E5"/>
               <w:left w:val="single" w:sz="5" w:space="0" w:color="C8D5E5"/>
@@ -1450,7 +1325,7 @@
         </w:tc>
         <w:tc>
           <w:tcPr>
-            <w:tcW w:w="979" w:type="dxa"/>
+            <w:tcW w:w="951" w:type="dxa"/>
             <w:tcBorders>
               <w:top w:val="single" w:sz="5" w:space="0" w:color="C8D5E5"/>
               <w:left w:val="single" w:sz="5" w:space="0" w:color="C8D5E5"/>
@@ -1477,27 +1352,19 @@
                 <w:color w:val="102A52"/>
                 <w:sz w:val="15"/>
               </w:rPr>
-              <w:t xml:space="preserve">Advance </w:t>
-            </w:r>
-            <w:r>
-              <w:rPr>
-                <w:rFonts w:ascii="Aptos" w:hAnsi="Aptos"/>
-                <w:b/>
-                <w:color w:val="102A52"/>
-                <w:sz w:val="15"/>
-              </w:rPr>
-              <w:t>Amount</w:t>
+              <w:t>Advance Amount</w:t>
             </w:r>
           </w:p>
         </w:tc>
       </w:tr>
       <w:tr>
         <w:trPr>
+          <w:trHeight w:val="675"/>
           <w:jc w:val="center"/>
         </w:trPr>
         <w:tc>
           <w:tcPr>
-            <w:tcW w:w="576" w:type="dxa"/>
+            <w:tcW w:w="560" w:type="dxa"/>
             <w:tcBorders>
               <w:top w:val="single" w:sz="5" w:space="0" w:color="C8D5E5"/>
               <w:left w:val="single" w:sz="5" w:space="0" w:color="C8D5E5"/>
@@ -1528,7 +1395,7 @@
         </w:tc>
         <w:tc>
           <w:tcPr>
-            <w:tcW w:w="2333" w:type="dxa"/>
+            <w:tcW w:w="2674" w:type="dxa"/>
             <w:tcBorders>
               <w:top w:val="single" w:sz="5" w:space="0" w:color="C8D5E5"/>
               <w:left w:val="single" w:sz="5" w:space="0" w:color="C8D5E5"/>
@@ -1557,13 +1424,23 @@
                 <w:color w:val="102A52"/>
                 <w:sz w:val="15"/>
               </w:rPr>
-              <w:t>Luxury Matte Ultra-Slim Magnetic Case for Realme Neo 8 – Anti-Fingerprint Heat Cooling Shockproof Back Cover</w:t>
+              <w:t>Magnetic Graphene Cooling Silicone Case for Realme GT Neo 8 – Snowflake Heat Dissipation Airbag Anti-Drop Back Cover</w:t>
             </w:r>
+          </w:p>
+          <w:p>
+            <w:pPr>
+              <w:spacing w:after="0" w:line="216" w:lineRule="auto"/>
+              <w:rPr>
+                <w:rFonts w:ascii="Aptos" w:hAnsi="Aptos"/>
+                <w:color w:val="102A52"/>
+                <w:sz w:val="15"/>
+              </w:rPr>
+            </w:pPr>
           </w:p>
         </w:tc>
         <w:tc>
           <w:tcPr>
-            <w:tcW w:w="1469" w:type="dxa"/>
+            <w:tcW w:w="1350" w:type="dxa"/>
             <w:tcBorders>
               <w:top w:val="single" w:sz="5" w:space="0" w:color="C8D5E5"/>
               <w:left w:val="single" w:sz="5" w:space="0" w:color="C8D5E5"/>
@@ -1588,13 +1465,44 @@
                 <w:color w:val="102A52"/>
                 <w:sz w:val="17"/>
               </w:rPr>
-              <w:t>Charcoal Gray</w:t>
+              <w:t>Matte Gray</w:t>
             </w:r>
           </w:p>
         </w:tc>
         <w:tc>
           <w:tcPr>
-            <w:tcW w:w="1656" w:type="dxa"/>
+            <w:tcW w:w="1350" w:type="dxa"/>
+            <w:tcBorders>
+              <w:top w:val="single" w:sz="5" w:space="0" w:color="C8D5E5"/>
+              <w:left w:val="single" w:sz="5" w:space="0" w:color="C8D5E5"/>
+              <w:bottom w:val="single" w:sz="5" w:space="0" w:color="C8D5E5"/>
+              <w:right w:val="single" w:sz="5" w:space="0" w:color="C8D5E5"/>
+            </w:tcBorders>
+          </w:tcPr>
+          <w:p>
+            <w:pPr>
+              <w:spacing w:after="0" w:line="216" w:lineRule="auto"/>
+              <w:rPr>
+                <w:rFonts w:ascii="Aptos" w:hAnsi="Aptos"/>
+                <w:b/>
+                <w:color w:val="102A52"/>
+                <w:sz w:val="17"/>
+              </w:rPr>
+            </w:pPr>
+            <w:r>
+              <w:rPr>
+                <w:rFonts w:ascii="Aptos" w:hAnsi="Aptos"/>
+                <w:b/>
+                <w:color w:val="102A52"/>
+                <w:sz w:val="17"/>
+              </w:rPr>
+              <w:t>thermoplastic</w:t>
+            </w:r>
+          </w:p>
+        </w:tc>
+        <w:tc>
+          <w:tcPr>
+            <w:tcW w:w="1542" w:type="dxa"/>
             <w:tcBorders>
               <w:top w:val="single" w:sz="5" w:space="0" w:color="C8D5E5"/>
               <w:left w:val="single" w:sz="5" w:space="0" w:color="C8D5E5"/>
@@ -1625,7 +1533,7 @@
         </w:tc>
         <w:tc>
           <w:tcPr>
-            <w:tcW w:w="1512" w:type="dxa"/>
+            <w:tcW w:w="1470" w:type="dxa"/>
             <w:tcBorders>
               <w:top w:val="single" w:sz="5" w:space="0" w:color="C8D5E5"/>
               <w:left w:val="single" w:sz="5" w:space="0" w:color="C8D5E5"/>
@@ -1656,7 +1564,7 @@
         </w:tc>
         <w:tc>
           <w:tcPr>
-            <w:tcW w:w="1123" w:type="dxa"/>
+            <w:tcW w:w="1091" w:type="dxa"/>
             <w:tcBorders>
               <w:top w:val="single" w:sz="5" w:space="0" w:color="C8D5E5"/>
               <w:left w:val="single" w:sz="5" w:space="0" w:color="C8D5E5"/>
@@ -1687,7 +1595,7 @@
         </w:tc>
         <w:tc>
           <w:tcPr>
-            <w:tcW w:w="1181" w:type="dxa"/>
+            <w:tcW w:w="1148" w:type="dxa"/>
             <w:tcBorders>
               <w:top w:val="single" w:sz="5" w:space="0" w:color="C8D5E5"/>
               <w:left w:val="single" w:sz="5" w:space="0" w:color="C8D5E5"/>
@@ -1712,13 +1620,13 @@
                 <w:color w:val="102A52"/>
                 <w:sz w:val="15"/>
               </w:rPr>
-              <w:t>599</w:t>
+              <w:t>699</w:t>
             </w:r>
           </w:p>
         </w:tc>
         <w:tc>
           <w:tcPr>
-            <w:tcW w:w="979" w:type="dxa"/>
+            <w:tcW w:w="951" w:type="dxa"/>
             <w:tcBorders>
               <w:top w:val="single" w:sz="5" w:space="0" w:color="C8D5E5"/>
               <w:left w:val="single" w:sz="5" w:space="0" w:color="C8D5E5"/>
@@ -1743,7 +1651,7 @@
                 <w:color w:val="102A52"/>
                 <w:sz w:val="15"/>
               </w:rPr>
-              <w:t>৳200</w:t>
+              <w:t>0</w:t>
             </w:r>
           </w:p>
         </w:tc>
@@ -1753,7 +1661,6 @@
       <w:pPr>
         <w:spacing w:before="160" w:after="100"/>
       </w:pPr>
-      <w:proofErr w:type="gramStart"/>
       <w:r>
         <w:rPr>
           <w:rFonts w:ascii="Aptos Display" w:hAnsi="Aptos Display"/>
@@ -1761,17 +1668,7 @@
           <w:color w:val="102A52"/>
           <w:sz w:val="23"/>
         </w:rPr>
-        <w:t>▰  DELIVERY</w:t>
-      </w:r>
-      <w:proofErr w:type="gramEnd"/>
-      <w:r>
-        <w:rPr>
-          <w:rFonts w:ascii="Aptos Display" w:hAnsi="Aptos Display"/>
-          <w:b/>
-          <w:color w:val="102A52"/>
-          <w:sz w:val="23"/>
-        </w:rPr>
-        <w:t xml:space="preserve"> &amp; PAYMENT</w:t>
+        <w:t>▰  DELIVERY &amp; PAYMENT</w:t>
       </w:r>
     </w:p>
     <w:tbl>
@@ -1881,7 +1778,7 @@
                       <w:color w:val="102A52"/>
                       <w:sz w:val="16"/>
                     </w:rPr>
-                    <w:t>0</w:t>
+                    <w:t>120</w:t>
                   </w:r>
                 </w:p>
               </w:tc>
@@ -1938,7 +1835,6 @@
                   <w:pPr>
                     <w:spacing w:after="0" w:line="216" w:lineRule="auto"/>
                   </w:pPr>
-                  <w:proofErr w:type="spellStart"/>
                   <w:r>
                     <w:rPr>
                       <w:rFonts w:ascii="Aptos" w:hAnsi="Aptos"/>
@@ -1947,7 +1843,6 @@
                     </w:rPr>
                     <w:t>Bkash</w:t>
                   </w:r>
-                  <w:proofErr w:type="spellEnd"/>
                 </w:p>
               </w:tc>
             </w:tr>
@@ -2110,7 +2005,7 @@
                 <w:color w:val="102A52"/>
                 <w:sz w:val="18"/>
               </w:rPr>
-              <w:t>Subtotal                         ৳</w:t>
+              <w:t xml:space="preserve">Subtotal                         </w:t>
             </w:r>
             <w:r>
               <w:rPr>
@@ -2118,7 +2013,7 @@
                 <w:color w:val="102A52"/>
                 <w:sz w:val="18"/>
               </w:rPr>
-              <w:t>599</w:t>
+              <w:t>720</w:t>
             </w:r>
             <w:r>
               <w:rPr>
@@ -2127,7 +2022,6 @@
                 <w:sz w:val="18"/>
               </w:rPr>
               <w:br/>
-              <w:t>Advance                         -</w:t>
             </w:r>
             <w:r>
               <w:rPr>
@@ -2135,7 +2029,7 @@
                 <w:color w:val="102A52"/>
                 <w:sz w:val="18"/>
               </w:rPr>
-              <w:t>৳</w:t>
+              <w:t xml:space="preserve">Discount </w:t>
             </w:r>
             <w:r>
               <w:rPr>
@@ -2143,7 +2037,15 @@
                 <w:color w:val="102A52"/>
                 <w:sz w:val="18"/>
               </w:rPr>
-              <w:t>200</w:t>
+              <w:t xml:space="preserve">                         -৳2</w:t>
+            </w:r>
+            <w:r>
+              <w:rPr>
+                <w:rFonts w:ascii="Aptos" w:hAnsi="Aptos"/>
+                <w:color w:val="102A52"/>
+                <w:sz w:val="18"/>
+              </w:rPr>
+              <w:t>1</w:t>
             </w:r>
           </w:p>
           <w:p>
@@ -2164,7 +2066,7 @@
                 <w:color w:val="102A52"/>
                 <w:sz w:val="18"/>
               </w:rPr>
-              <w:t>0</w:t>
+              <w:t>120</w:t>
             </w:r>
           </w:p>
           <w:p>
@@ -2205,7 +2107,7 @@
                 <w:color w:val="102A52"/>
                 <w:sz w:val="24"/>
               </w:rPr>
-              <w:t>399</w:t>
+              <w:t>819</w:t>
             </w:r>
           </w:p>
         </w:tc>

</xml_diff>